<commit_message>
Carry the gas-chain framing into the cover letter
The opening sentence now spans gas processing, NGL trains, associated gas
gathering and gas-fired power generation, and the AGG plant is named as an
upstream associated-gas facility, matching the CV. Still one page.

Co-Authored-By: Claude Opus 5 <noreply@anthropic.com>
Claude-Session: https://claude.ai/code/session_013H3AMzMWzEerJx7AeqeVQp
</commit_message>
<xml_diff>
--- a/AZODO_EMEKA_Cover_Letter_Rotating_Equipment_Engineer_QatarEnergyLNG.docx
+++ b/AZODO_EMEKA_Cover_Letter_Rotating_Equipment_Engineer_QatarEnergyLNG.docx
@@ -169,7 +169,7 @@
           <w:color w:val="1A1A1A"/>
           <w:sz w:val="20"/>
         </w:rPr>
-        <w:t>I am applying for the Rotating Equipment Engineer position at Ras Laffan 2 South. I am a mechanical engineer with over ten years in rotating equipment engineering, currently the Machinery Engineer for the Oso Gas Hub — the largest offshore gas processing facility in the Seplat joint venture — and the accountabilities in your posting describe what I already do each day.</w:t>
+        <w:t>I am applying for the Rotating Equipment Engineer position at Ras Laffan 2 South. I am a mechanical engineer with over ten years in rotating equipment engineering across gas processing, NGL trains, associated gas gathering and gas-fired power generation, currently the Machinery Engineer for the Oso Gas Hub — the largest offshore gas processing facility in the Seplat joint venture — and the accountabilities in your posting describe what I already do each day.</w:t>
       </w:r>
     </w:p>
     <w:p>
@@ -233,7 +233,7 @@
           <w:color w:val="1A1A1A"/>
           <w:sz w:val="20"/>
         </w:rPr>
-        <w:t>The remainder of the role is familiar ground: RCFA and risk assessment, review of equipment and system changes for reliability and operability, technical review of vendor documentation and deviations, machinery FAT witnessing, and commissioning and start-up support. I developed and now steward the Pre-Startup Safety Review process for turbines and compressors at Oso, and I supported the Imo River associated gas gathering plant start-up as lead mechanical and reliability engineer. My OEM and vendor work spans Solar Turbines, GE, Siemens and Honeywell CCC anti-surge and turbomachinery control.</w:t>
+        <w:t>The remainder of the role is familiar ground: RCFA and risk assessment, review of equipment and system changes for reliability and operability, technical review of vendor documentation and deviations, machinery FAT witnessing, and commissioning and start-up support. I developed and now steward the Pre-Startup Safety Review process for turbines and compressors at Oso, and I was lead mechanical and reliability engineer for the start-up of the Imo River Associated Gas Gathering plant, an upstream associated-gas facility. My OEM and vendor work spans Solar Turbines, GE, Siemens and Honeywell CCC anti-surge and turbomachinery control.</w:t>
       </w:r>
     </w:p>
     <w:p>

</xml_diff>